<commit_message>
Fix lease record permissions
</commit_message>
<xml_diff>
--- a/docs/Rent Renewal Tracker Knowledge Base and User Manual.docx
+++ b/docs/Rent Renewal Tracker Knowledge Base and User Manual.docx
@@ -74,7 +74,7 @@
           <w:color w:val="5F6C76"/>
           <w:sz w:val="20"/>
         </w:rPr>
-        <w:t>Prepared 13 July 2026</w:t>
+        <w:t>Prepared 15 July 2026</w:t>
       </w:r>
     </w:p>
     <w:p/>
@@ -191,7 +191,7 @@
                 <w:color w:val="263038"/>
                 <w:sz w:val="20"/>
               </w:rPr>
-              <w:t>This manual is derived from the application source in this workspace as of 13 July 2026. It documents implemented behavior. Site-specific Frappe configuration, custom roles, email accounts, print formats, and future code changes may alter what an individual user sees.</w:t>
+              <w:t>This manual is derived from the application source in this workspace as of 15 July 2026. It documents implemented behavior. Site-specific Frappe configuration, custom roles, email accounts, print formats, and future code changes may alter what an individual user sees.</w:t>
             </w:r>
           </w:p>
         </w:tc>
@@ -742,34 +742,31 @@
       </w:r>
     </w:p>
     <w:p>
-      <w:pPr>
-        <w:pStyle w:val="Heading1"/>
-      </w:pPr>
-      <w:r>
-        <w:t>4. Opening the App</w:t>
-      </w:r>
-    </w:p>
-    <w:p>
       <w:r>
         <w:rPr>
           <w:rFonts w:ascii="Calibri" w:hAnsi="Calibri"/>
           <w:color w:val="263038"/>
           <w:sz w:val="21"/>
         </w:rPr>
-        <w:t>After signing in to Frappe:</w:t>
-      </w:r>
-    </w:p>
-    <w:p>
-      <w:pPr>
-        <w:pStyle w:val="ListNumber"/>
-      </w:pPr>
+        <w:t>Role permission makes a DocType available, while record-level authorization determines which specific records the user may open or change. Lease assignment, Lease Department User Permissions, and confidentiality clearance are rechecked when a record is opened or saved.</w:t>
+      </w:r>
+    </w:p>
+    <w:p>
+      <w:pPr>
+        <w:pStyle w:val="Heading1"/>
+      </w:pPr>
+      <w:r>
+        <w:t>4. Opening the App</w:t>
+      </w:r>
+    </w:p>
+    <w:p>
       <w:r>
         <w:rPr>
           <w:rFonts w:ascii="Calibri" w:hAnsi="Calibri"/>
           <w:color w:val="263038"/>
           <w:sz w:val="21"/>
         </w:rPr>
-        <w:t>Open the app launcher or desk menu.</w:t>
+        <w:t>After signing in to Frappe:</w:t>
       </w:r>
     </w:p>
     <w:p>
@@ -782,6 +779,19 @@
           <w:color w:val="263038"/>
           <w:sz w:val="21"/>
         </w:rPr>
+        <w:t>Open the app launcher or desk menu.</w:t>
+      </w:r>
+    </w:p>
+    <w:p>
+      <w:pPr>
+        <w:pStyle w:val="ListNumber"/>
+      </w:pPr>
+      <w:r>
+        <w:rPr>
+          <w:rFonts w:ascii="Calibri" w:hAnsi="Calibri"/>
+          <w:color w:val="263038"/>
+          <w:sz w:val="21"/>
+        </w:rPr>
         <w:t xml:space="preserve">Select </w:t>
       </w:r>
       <w:r>
@@ -2860,6 +2870,108 @@
           <w:sz w:val="21"/>
         </w:rPr>
         <w:t>Save the record.</w:t>
+      </w:r>
+    </w:p>
+    <w:p>
+      <w:r>
+        <w:rPr>
+          <w:rFonts w:ascii="Calibri" w:hAnsi="Calibri"/>
+          <w:color w:val="263038"/>
+          <w:sz w:val="21"/>
+        </w:rPr>
+        <w:t>The save operation applies both the role permission and the record-level lease scope:</w:t>
+      </w:r>
+    </w:p>
+    <w:p>
+      <w:pPr>
+        <w:pStyle w:val="ListBullet"/>
+      </w:pPr>
+      <w:r>
+        <w:rPr>
+          <w:rFonts w:ascii="Consolas" w:hAnsi="Consolas"/>
+          <w:color w:val="246382"/>
+          <w:sz w:val="20"/>
+        </w:rPr>
+        <w:t>Rent Renewal System Manager</w:t>
+      </w:r>
+      <w:r>
+        <w:rPr>
+          <w:rFonts w:ascii="Calibri" w:hAnsi="Calibri"/>
+          <w:color w:val="263038"/>
+          <w:sz w:val="21"/>
+        </w:rPr>
+        <w:t xml:space="preserve"> and </w:t>
+      </w:r>
+      <w:r>
+        <w:rPr>
+          <w:rFonts w:ascii="Consolas" w:hAnsi="Consolas"/>
+          <w:color w:val="246382"/>
+          <w:sz w:val="20"/>
+        </w:rPr>
+        <w:t>Lease Administrator</w:t>
+      </w:r>
+      <w:r>
+        <w:rPr>
+          <w:rFonts w:ascii="Calibri" w:hAnsi="Calibri"/>
+          <w:color w:val="263038"/>
+          <w:sz w:val="21"/>
+        </w:rPr>
+        <w:t xml:space="preserve"> may create a Lease without being assigned to it because they are unrestricted operational roles.</w:t>
+      </w:r>
+    </w:p>
+    <w:p>
+      <w:pPr>
+        <w:pStyle w:val="ListBullet"/>
+      </w:pPr>
+      <w:r>
+        <w:rPr>
+          <w:rFonts w:ascii="Calibri" w:hAnsi="Calibri"/>
+          <w:color w:val="263038"/>
+          <w:sz w:val="21"/>
+        </w:rPr>
+        <w:t xml:space="preserve">A </w:t>
+      </w:r>
+      <w:r>
+        <w:rPr>
+          <w:rFonts w:ascii="Consolas" w:hAnsi="Consolas"/>
+          <w:color w:val="246382"/>
+          <w:sz w:val="20"/>
+        </w:rPr>
+        <w:t>Responsible Officer</w:t>
+      </w:r>
+      <w:r>
+        <w:rPr>
+          <w:rFonts w:ascii="Calibri" w:hAnsi="Calibri"/>
+          <w:color w:val="263038"/>
+          <w:sz w:val="21"/>
+        </w:rPr>
+        <w:t xml:space="preserve"> may create a Lease only when the new record assigns that user as Responsible Officer, Contract Owner, or Backup Officer, or the user has a matching Lease Department User Permission. The selected confidentiality classification must also be within the user's clearance.</w:t>
+      </w:r>
+    </w:p>
+    <w:p>
+      <w:r>
+        <w:rPr>
+          <w:rFonts w:ascii="Calibri" w:hAnsi="Calibri"/>
+          <w:color w:val="263038"/>
+          <w:sz w:val="21"/>
+        </w:rPr>
+        <w:t xml:space="preserve">Lease Documents, Rent Schedules, Renewal Requests, and Reminder Logs repeat the parent Lease authorization check through their required </w:t>
+      </w:r>
+      <w:r>
+        <w:rPr>
+          <w:rFonts w:ascii="Consolas" w:hAnsi="Consolas"/>
+          <w:color w:val="246382"/>
+          <w:sz w:val="20"/>
+        </w:rPr>
+        <w:t>Lease</w:t>
+      </w:r>
+      <w:r>
+        <w:rPr>
+          <w:rFonts w:ascii="Calibri" w:hAnsi="Calibri"/>
+          <w:color w:val="263038"/>
+          <w:sz w:val="21"/>
+        </w:rPr>
+        <w:t xml:space="preserve"> link.</w:t>
       </w:r>
     </w:p>
     <w:p>
@@ -8818,7 +8930,7 @@
           <w:color w:val="263038"/>
           <w:sz w:val="21"/>
         </w:rPr>
-        <w:t>If a user cannot edit a record, first verify their role and the current workflow state.</w:t>
+        <w:t>If a user cannot create or edit a Lease, verify their role, assignment or Lease Department User Permission, confidentiality clearance, and the current workflow or document state.</w:t>
       </w:r>
     </w:p>
     <w:p>
@@ -9256,6 +9368,16 @@
           <w:sz w:val="21"/>
         </w:rPr>
         <w:t>For scoped users, a lease is visible when the user is the Responsible Officer, Contract Owner, or Backup Officer, or when a Frappe User Permission grants that user the lease's Lease Department. The User Permission must allow Lease Department, match Responsible Department, and either be globally applicable or applicable to Lease. The same rule flows down to Renewal Requests, Rent Schedules, Lease Documents, and Reminder Logs through their Lease link.</w:t>
+      </w:r>
+    </w:p>
+    <w:p>
+      <w:r>
+        <w:rPr>
+          <w:rFonts w:ascii="Calibri" w:hAnsi="Calibri"/>
+          <w:color w:val="263038"/>
+          <w:sz w:val="21"/>
+        </w:rPr>
+        <w:t>When a new Lease is saved, the same scope is evaluated from its proposed values before insertion. Unrestricted operational roles may create without assignment. A Responsible Officer must assign themselves as Responsible Officer, Contract Owner, or Backup Officer, or hold the matching Lease Department User Permission, and the selected classification must be within their clearance. Related records must link to a Lease the user is authorized to access.</w:t>
       </w:r>
     </w:p>
     <w:p>

</xml_diff>

<commit_message>
Clarify Lease Document creation permissions
</commit_message>
<xml_diff>
--- a/docs/Rent Renewal Tracker Knowledge Base and User Manual.docx
+++ b/docs/Rent Renewal Tracker Knowledge Base and User Manual.docx
@@ -4897,39 +4897,55 @@
       </w:r>
     </w:p>
     <w:p>
+      <w:pPr>
+        <w:pStyle w:val="Heading2"/>
+      </w:pPr>
+      <w:r>
+        <w:t>11.2 Who Can Create a Lease Document?</w:t>
+      </w:r>
+    </w:p>
+    <w:p>
       <w:r>
         <w:rPr>
           <w:rFonts w:ascii="Calibri" w:hAnsi="Calibri"/>
           <w:color w:val="263038"/>
           <w:sz w:val="21"/>
         </w:rPr>
-        <w:t>Every attached file must also be private. The application checks the user's permission to use the File record, its owner or original attachment, the allowed file extension, and the site's maximum file size. After attachment, Frappe resolves private-file access through the Lease Document, so the linked Lease scope and document confidentiality rule also govern file reads and downloads.</w:t>
-      </w:r>
-    </w:p>
-    <w:p>
-      <w:pPr>
-        <w:pStyle w:val="Heading2"/>
-      </w:pPr>
-      <w:r>
-        <w:t>11.2 Creating and Controlling Revisions</w:t>
-      </w:r>
-    </w:p>
-    <w:p>
+        <w:t>Under the application's default DocType permissions:</w:t>
+      </w:r>
+    </w:p>
+    <w:p>
+      <w:pPr>
+        <w:pStyle w:val="ListBullet"/>
+      </w:pPr>
+      <w:r>
+        <w:rPr>
+          <w:rFonts w:ascii="Consolas" w:hAnsi="Consolas"/>
+          <w:color w:val="246382"/>
+          <w:sz w:val="20"/>
+        </w:rPr>
+        <w:t>Administrator</w:t>
+      </w:r>
       <w:r>
         <w:rPr>
           <w:rFonts w:ascii="Calibri" w:hAnsi="Calibri"/>
           <w:color w:val="263038"/>
           <w:sz w:val="21"/>
         </w:rPr>
-        <w:t xml:space="preserve">The </w:t>
-      </w:r>
+        <w:t xml:space="preserve"> can create a Lease Document linked to any existing Lease because Frappe grants Administrator a permission bypass.</w:t>
+      </w:r>
+    </w:p>
+    <w:p>
+      <w:pPr>
+        <w:pStyle w:val="ListBullet"/>
+      </w:pPr>
       <w:r>
         <w:rPr>
           <w:rFonts w:ascii="Consolas" w:hAnsi="Consolas"/>
           <w:color w:val="246382"/>
           <w:sz w:val="20"/>
         </w:rPr>
-        <w:t>Create Revision</w:t>
+        <w:t>Rent Renewal System Manager</w:t>
       </w:r>
       <w:r>
         <w:rPr>
@@ -4937,7 +4953,7 @@
           <w:color w:val="263038"/>
           <w:sz w:val="21"/>
         </w:rPr>
-        <w:t xml:space="preserve"> action appears only for a current revision when the user can create Lease Documents and can write the current record. The new record receives its name before the application assigns Document Family ID, Revision number, Revised By, and Revised On through Frappe's validation lifecycle. A revision must use a different private file, remain on the same Lease, include a Revision Reason, and branch from the current revision. Saving it updates the previous revision through the normal Frappe save lifecycle, including permission checks and change tracking, and marks the previous revision </w:t>
+        <w:t xml:space="preserve"> and </w:t>
       </w:r>
       <w:r>
         <w:rPr>
@@ -4945,7 +4961,7 @@
           <w:color w:val="246382"/>
           <w:sz w:val="20"/>
         </w:rPr>
-        <w:t>Superseded</w:t>
+        <w:t>Lease Administrator</w:t>
       </w:r>
       <w:r>
         <w:rPr>
@@ -4953,66 +4969,97 @@
           <w:color w:val="263038"/>
           <w:sz w:val="21"/>
         </w:rPr>
-        <w:t>.</w:t>
-      </w:r>
-    </w:p>
-    <w:p>
+        <w:t xml:space="preserve"> can create a Lease Document linked to any existing Lease. These roles bypass Lease assignment, department scope, and confidentiality filters.</w:t>
+      </w:r>
+    </w:p>
+    <w:p>
+      <w:pPr>
+        <w:pStyle w:val="ListBullet"/>
+      </w:pPr>
+      <w:r>
+        <w:rPr>
+          <w:rFonts w:ascii="Consolas" w:hAnsi="Consolas"/>
+          <w:color w:val="246382"/>
+          <w:sz w:val="20"/>
+        </w:rPr>
+        <w:t>Responsible Officer</w:t>
+      </w:r>
       <w:r>
         <w:rPr>
           <w:rFonts w:ascii="Calibri" w:hAnsi="Calibri"/>
           <w:color w:val="263038"/>
           <w:sz w:val="21"/>
         </w:rPr>
-        <w:t>Document classifications and revision permissions are enforced on direct API requests as well as the Desk form; hiding the button is only a usability aid.</w:t>
-      </w:r>
-    </w:p>
-    <w:p>
+        <w:t xml:space="preserve"> can create a Lease Document only when the linked Lease is within the user's assignment or Lease Department scope and both the parent Lease and the document are within the user's confidentiality clearance.</w:t>
+      </w:r>
+    </w:p>
+    <w:p>
+      <w:pPr>
+        <w:pStyle w:val="ListBullet"/>
+      </w:pPr>
+      <w:r>
+        <w:rPr>
+          <w:rFonts w:ascii="Consolas" w:hAnsi="Consolas"/>
+          <w:color w:val="246382"/>
+          <w:sz w:val="20"/>
+        </w:rPr>
+        <w:t>System Manager</w:t>
+      </w:r>
       <w:r>
         <w:rPr>
           <w:rFonts w:ascii="Calibri" w:hAnsi="Calibri"/>
           <w:color w:val="263038"/>
           <w:sz w:val="21"/>
         </w:rPr>
-        <w:t>Document categories include:</w:t>
-      </w:r>
-    </w:p>
-    <w:p>
-      <w:pPr>
-        <w:pStyle w:val="ListBullet"/>
-      </w:pPr>
+        <w:t xml:space="preserve"> by itself cannot create a Lease Document. The role bypasses the application's record-level Lease filters, but it does not have Lease Document create permission in the default DocType permission matrix. The user must also hold </w:t>
+      </w:r>
       <w:r>
         <w:rPr>
           <w:rFonts w:ascii="Consolas" w:hAnsi="Consolas"/>
           <w:color w:val="246382"/>
           <w:sz w:val="20"/>
         </w:rPr>
-        <w:t>Signed Agreement</w:t>
-      </w:r>
-    </w:p>
-    <w:p>
-      <w:pPr>
-        <w:pStyle w:val="ListBullet"/>
-      </w:pPr>
+        <w:t>Rent Renewal System Manager</w:t>
+      </w:r>
+      <w:r>
+        <w:rPr>
+          <w:rFonts w:ascii="Calibri" w:hAnsi="Calibri"/>
+          <w:color w:val="263038"/>
+          <w:sz w:val="21"/>
+        </w:rPr>
+        <w:t xml:space="preserve">, </w:t>
+      </w:r>
       <w:r>
         <w:rPr>
           <w:rFonts w:ascii="Consolas" w:hAnsi="Consolas"/>
           <w:color w:val="246382"/>
           <w:sz w:val="20"/>
         </w:rPr>
-        <w:t>Addendum</w:t>
-      </w:r>
-    </w:p>
-    <w:p>
-      <w:pPr>
-        <w:pStyle w:val="ListBullet"/>
-      </w:pPr>
+        <w:t>Lease Administrator</w:t>
+      </w:r>
+      <w:r>
+        <w:rPr>
+          <w:rFonts w:ascii="Calibri" w:hAnsi="Calibri"/>
+          <w:color w:val="263038"/>
+          <w:sz w:val="21"/>
+        </w:rPr>
+        <w:t xml:space="preserve">, </w:t>
+      </w:r>
       <w:r>
         <w:rPr>
           <w:rFonts w:ascii="Consolas" w:hAnsi="Consolas"/>
           <w:color w:val="246382"/>
           <w:sz w:val="20"/>
         </w:rPr>
-        <w:t>Renewal Letter</w:t>
+        <w:t>Responsible Officer</w:t>
+      </w:r>
+      <w:r>
+        <w:rPr>
+          <w:rFonts w:ascii="Calibri" w:hAnsi="Calibri"/>
+          <w:color w:val="263038"/>
+          <w:sz w:val="21"/>
+        </w:rPr>
+        <w:t>, or an explicitly configured custom create permission.</w:t>
       </w:r>
     </w:p>
     <w:p>
@@ -5025,95 +5072,105 @@
           <w:color w:val="246382"/>
           <w:sz w:val="20"/>
         </w:rPr>
-        <w:t>Approval</w:t>
-      </w:r>
-    </w:p>
-    <w:p>
-      <w:pPr>
-        <w:pStyle w:val="ListBullet"/>
-      </w:pPr>
+        <w:t>Department Head</w:t>
+      </w:r>
+      <w:r>
+        <w:rPr>
+          <w:rFonts w:ascii="Calibri" w:hAnsi="Calibri"/>
+          <w:color w:val="263038"/>
+          <w:sz w:val="21"/>
+        </w:rPr>
+        <w:t xml:space="preserve">, </w:t>
+      </w:r>
       <w:r>
         <w:rPr>
           <w:rFonts w:ascii="Consolas" w:hAnsi="Consolas"/>
           <w:color w:val="246382"/>
           <w:sz w:val="20"/>
         </w:rPr>
-        <w:t>Payment Receipt</w:t>
-      </w:r>
-    </w:p>
-    <w:p>
-      <w:pPr>
-        <w:pStyle w:val="ListBullet"/>
-      </w:pPr>
+        <w:t>Finance Approver</w:t>
+      </w:r>
+      <w:r>
+        <w:rPr>
+          <w:rFonts w:ascii="Calibri" w:hAnsi="Calibri"/>
+          <w:color w:val="263038"/>
+          <w:sz w:val="21"/>
+        </w:rPr>
+        <w:t xml:space="preserve">, </w:t>
+      </w:r>
       <w:r>
         <w:rPr>
           <w:rFonts w:ascii="Consolas" w:hAnsi="Consolas"/>
           <w:color w:val="246382"/>
           <w:sz w:val="20"/>
         </w:rPr>
-        <w:t>Valuation</w:t>
-      </w:r>
-    </w:p>
-    <w:p>
-      <w:pPr>
-        <w:pStyle w:val="ListBullet"/>
-      </w:pPr>
+        <w:t>Legal Approver</w:t>
+      </w:r>
+      <w:r>
+        <w:rPr>
+          <w:rFonts w:ascii="Calibri" w:hAnsi="Calibri"/>
+          <w:color w:val="263038"/>
+          <w:sz w:val="21"/>
+        </w:rPr>
+        <w:t xml:space="preserve">, </w:t>
+      </w:r>
       <w:r>
         <w:rPr>
           <w:rFonts w:ascii="Consolas" w:hAnsi="Consolas"/>
           <w:color w:val="246382"/>
           <w:sz w:val="20"/>
         </w:rPr>
-        <w:t>Correspondence</w:t>
-      </w:r>
-    </w:p>
-    <w:p>
-      <w:pPr>
-        <w:pStyle w:val="ListBullet"/>
-      </w:pPr>
+        <w:t>Management Approver</w:t>
+      </w:r>
+      <w:r>
+        <w:rPr>
+          <w:rFonts w:ascii="Calibri" w:hAnsi="Calibri"/>
+          <w:color w:val="263038"/>
+          <w:sz w:val="21"/>
+        </w:rPr>
+        <w:t xml:space="preserve">, </w:t>
+      </w:r>
       <w:r>
         <w:rPr>
           <w:rFonts w:ascii="Consolas" w:hAnsi="Consolas"/>
           <w:color w:val="246382"/>
           <w:sz w:val="20"/>
         </w:rPr>
-        <w:t>Other</w:t>
-      </w:r>
-    </w:p>
-    <w:p>
+        <w:t>Lease Auditor</w:t>
+      </w:r>
       <w:r>
         <w:rPr>
           <w:rFonts w:ascii="Calibri" w:hAnsi="Calibri"/>
           <w:color w:val="263038"/>
           <w:sz w:val="21"/>
         </w:rPr>
-        <w:t>Important rule:</w:t>
-      </w:r>
-    </w:p>
-    <w:p>
-      <w:pPr>
-        <w:pStyle w:val="ListBullet"/>
-      </w:pPr>
+        <w:t xml:space="preserve">, and </w:t>
+      </w:r>
+      <w:r>
+        <w:rPr>
+          <w:rFonts w:ascii="Consolas" w:hAnsi="Consolas"/>
+          <w:color w:val="246382"/>
+          <w:sz w:val="20"/>
+        </w:rPr>
+        <w:t>Lease Viewer</w:t>
+      </w:r>
       <w:r>
         <w:rPr>
           <w:rFonts w:ascii="Calibri" w:hAnsi="Calibri"/>
           <w:color w:val="263038"/>
           <w:sz w:val="21"/>
         </w:rPr>
-        <w:t>A completed renewal requires a private supporting document before the workflow can be finalized.</w:t>
-      </w:r>
-    </w:p>
-    <w:p>
-      <w:pPr>
-        <w:pStyle w:val="ListBullet"/>
-      </w:pPr>
+        <w:t xml:space="preserve"> cannot create Lease Documents with only those roles. Their default Lease Document access is read-oriented.</w:t>
+      </w:r>
+    </w:p>
+    <w:p>
       <w:r>
         <w:rPr>
           <w:rFonts w:ascii="Calibri" w:hAnsi="Calibri"/>
           <w:color w:val="263038"/>
           <w:sz w:val="21"/>
         </w:rPr>
-        <w:t xml:space="preserve">If the recommendation is not </w:t>
+        <w:t xml:space="preserve">The </w:t>
       </w:r>
       <w:r>
         <w:rPr>
@@ -5121,7 +5178,7 @@
           <w:color w:val="246382"/>
           <w:sz w:val="20"/>
         </w:rPr>
-        <w:t>Terminate</w:t>
+        <w:t>Lease</w:t>
       </w:r>
       <w:r>
         <w:rPr>
@@ -5129,7 +5186,25 @@
           <w:color w:val="263038"/>
           <w:sz w:val="21"/>
         </w:rPr>
-        <w:t xml:space="preserve">, the required category is </w:t>
+        <w:t xml:space="preserve"> field is mandatory and must link to a saved Lease. Being named as Responsible Officer, Contract Owner, Backup Officer, a Lease contact, or an approver does not by itself grant Lease Document creation. The user must first have a role that grants Lease Document create permission.</w:t>
+      </w:r>
+    </w:p>
+    <w:p>
+      <w:pPr>
+        <w:pStyle w:val="Heading2"/>
+      </w:pPr>
+      <w:r>
+        <w:t>11.3 Exact Linked-Lease Requirements for a Responsible Officer</w:t>
+      </w:r>
+    </w:p>
+    <w:p>
+      <w:r>
+        <w:rPr>
+          <w:rFonts w:ascii="Calibri" w:hAnsi="Calibri"/>
+          <w:color w:val="263038"/>
+          <w:sz w:val="21"/>
+        </w:rPr>
+        <w:t xml:space="preserve">A user relying on the </w:t>
       </w:r>
       <w:r>
         <w:rPr>
@@ -5137,7 +5212,7 @@
           <w:color w:val="246382"/>
           <w:sz w:val="20"/>
         </w:rPr>
-        <w:t>Renewal Letter</w:t>
+        <w:t>Responsible Officer</w:t>
       </w:r>
       <w:r>
         <w:rPr>
@@ -5145,7 +5220,7 @@
           <w:color w:val="263038"/>
           <w:sz w:val="21"/>
         </w:rPr>
-        <w:t>.</w:t>
+        <w:t xml:space="preserve"> role must satisfy at least one of these scope conditions on the selected Lease:</w:t>
       </w:r>
     </w:p>
     <w:p>
@@ -5158,7 +5233,7 @@
           <w:color w:val="263038"/>
           <w:sz w:val="21"/>
         </w:rPr>
-        <w:t xml:space="preserve">If the recommendation is </w:t>
+        <w:t xml:space="preserve">The user's account is entered in </w:t>
       </w:r>
       <w:r>
         <w:rPr>
@@ -5166,7 +5241,7 @@
           <w:color w:val="246382"/>
           <w:sz w:val="20"/>
         </w:rPr>
-        <w:t>Terminate</w:t>
+        <w:t>Responsible Officer</w:t>
       </w:r>
       <w:r>
         <w:rPr>
@@ -5174,7 +5249,20 @@
           <w:color w:val="263038"/>
           <w:sz w:val="21"/>
         </w:rPr>
-        <w:t xml:space="preserve">, the required category is </w:t>
+        <w:t>.</w:t>
+      </w:r>
+    </w:p>
+    <w:p>
+      <w:pPr>
+        <w:pStyle w:val="ListBullet"/>
+      </w:pPr>
+      <w:r>
+        <w:rPr>
+          <w:rFonts w:ascii="Calibri" w:hAnsi="Calibri"/>
+          <w:color w:val="263038"/>
+          <w:sz w:val="21"/>
+        </w:rPr>
+        <w:t xml:space="preserve">The user's account is entered in </w:t>
       </w:r>
       <w:r>
         <w:rPr>
@@ -5182,7 +5270,7 @@
           <w:color w:val="246382"/>
           <w:sz w:val="20"/>
         </w:rPr>
-        <w:t>Approval</w:t>
+        <w:t>Contract Owner</w:t>
       </w:r>
       <w:r>
         <w:rPr>
@@ -5195,20 +5283,15 @@
     </w:p>
     <w:p>
       <w:pPr>
-        <w:pStyle w:val="Heading1"/>
-      </w:pPr>
-      <w:r>
-        <w:t>12. Rent Schedules and Payment Tracking</w:t>
-      </w:r>
-    </w:p>
-    <w:p>
+        <w:pStyle w:val="ListBullet"/>
+      </w:pPr>
       <w:r>
         <w:rPr>
           <w:rFonts w:ascii="Calibri" w:hAnsi="Calibri"/>
           <w:color w:val="263038"/>
           <w:sz w:val="21"/>
         </w:rPr>
-        <w:t xml:space="preserve">Open </w:t>
+        <w:t xml:space="preserve">The user's account is entered in </w:t>
       </w:r>
       <w:r>
         <w:rPr>
@@ -5216,7 +5299,7 @@
           <w:color w:val="246382"/>
           <w:sz w:val="20"/>
         </w:rPr>
-        <w:t>Operations &gt; Rent Schedules</w:t>
+        <w:t>Backup Officer</w:t>
       </w:r>
       <w:r>
         <w:rPr>
@@ -5228,203 +5311,308 @@
       </w:r>
     </w:p>
     <w:p>
+      <w:pPr>
+        <w:pStyle w:val="ListBullet"/>
+      </w:pPr>
       <w:r>
         <w:rPr>
           <w:rFonts w:ascii="Calibri" w:hAnsi="Calibri"/>
           <w:color w:val="263038"/>
           <w:sz w:val="21"/>
         </w:rPr>
-        <w:t>Use rent schedules to track planned payment obligations by lease and period.</w:t>
-      </w:r>
-    </w:p>
-    <w:p>
-      <w:pPr>
-        <w:pStyle w:val="Heading2"/>
-      </w:pPr>
-      <w:r>
-        <w:t>12.1 Key Fields</w:t>
-      </w:r>
-    </w:p>
-    <w:p>
-      <w:pPr>
-        <w:pStyle w:val="ListBullet"/>
-      </w:pPr>
+        <w:t xml:space="preserve">The user has a Frappe User Permission with </w:t>
+      </w:r>
       <w:r>
         <w:rPr>
           <w:rFonts w:ascii="Consolas" w:hAnsi="Consolas"/>
           <w:color w:val="246382"/>
           <w:sz w:val="20"/>
         </w:rPr>
-        <w:t>Lease</w:t>
-      </w:r>
-    </w:p>
-    <w:p>
-      <w:pPr>
-        <w:pStyle w:val="ListBullet"/>
-      </w:pPr>
+        <w:t>Allow</w:t>
+      </w:r>
+      <w:r>
+        <w:rPr>
+          <w:rFonts w:ascii="Calibri" w:hAnsi="Calibri"/>
+          <w:color w:val="263038"/>
+          <w:sz w:val="21"/>
+        </w:rPr>
+        <w:t xml:space="preserve"> set to </w:t>
+      </w:r>
       <w:r>
         <w:rPr>
           <w:rFonts w:ascii="Consolas" w:hAnsi="Consolas"/>
           <w:color w:val="246382"/>
           <w:sz w:val="20"/>
         </w:rPr>
-        <w:t>Description</w:t>
-      </w:r>
-    </w:p>
-    <w:p>
-      <w:pPr>
-        <w:pStyle w:val="ListBullet"/>
-      </w:pPr>
+        <w:t>Lease Department</w:t>
+      </w:r>
+      <w:r>
+        <w:rPr>
+          <w:rFonts w:ascii="Calibri" w:hAnsi="Calibri"/>
+          <w:color w:val="263038"/>
+          <w:sz w:val="21"/>
+        </w:rPr>
+        <w:t xml:space="preserve">, </w:t>
+      </w:r>
       <w:r>
         <w:rPr>
           <w:rFonts w:ascii="Consolas" w:hAnsi="Consolas"/>
           <w:color w:val="246382"/>
           <w:sz w:val="20"/>
         </w:rPr>
-        <w:t>Period From</w:t>
-      </w:r>
-    </w:p>
-    <w:p>
-      <w:pPr>
-        <w:pStyle w:val="ListBullet"/>
-      </w:pPr>
+        <w:t>For Value</w:t>
+      </w:r>
+      <w:r>
+        <w:rPr>
+          <w:rFonts w:ascii="Calibri" w:hAnsi="Calibri"/>
+          <w:color w:val="263038"/>
+          <w:sz w:val="21"/>
+        </w:rPr>
+        <w:t xml:space="preserve"> matching the Lease's </w:t>
+      </w:r>
       <w:r>
         <w:rPr>
           <w:rFonts w:ascii="Consolas" w:hAnsi="Consolas"/>
           <w:color w:val="246382"/>
           <w:sz w:val="20"/>
         </w:rPr>
-        <w:t>Period To</w:t>
-      </w:r>
-    </w:p>
-    <w:p>
-      <w:pPr>
-        <w:pStyle w:val="ListBullet"/>
-      </w:pPr>
+        <w:t>Responsible Department</w:t>
+      </w:r>
+      <w:r>
+        <w:rPr>
+          <w:rFonts w:ascii="Calibri" w:hAnsi="Calibri"/>
+          <w:color w:val="263038"/>
+          <w:sz w:val="21"/>
+        </w:rPr>
+        <w:t xml:space="preserve">, and </w:t>
+      </w:r>
       <w:r>
         <w:rPr>
           <w:rFonts w:ascii="Consolas" w:hAnsi="Consolas"/>
           <w:color w:val="246382"/>
           <w:sz w:val="20"/>
         </w:rPr>
-        <w:t>Due Date</w:t>
-      </w:r>
-    </w:p>
-    <w:p>
-      <w:pPr>
-        <w:pStyle w:val="ListBullet"/>
-      </w:pPr>
+        <w:t>Applicable For</w:t>
+      </w:r>
+      <w:r>
+        <w:rPr>
+          <w:rFonts w:ascii="Calibri" w:hAnsi="Calibri"/>
+          <w:color w:val="263038"/>
+          <w:sz w:val="21"/>
+        </w:rPr>
+        <w:t xml:space="preserve"> set to </w:t>
+      </w:r>
       <w:r>
         <w:rPr>
           <w:rFonts w:ascii="Consolas" w:hAnsi="Consolas"/>
           <w:color w:val="246382"/>
           <w:sz w:val="20"/>
         </w:rPr>
-        <w:t>Currency</w:t>
-      </w:r>
-    </w:p>
-    <w:p>
-      <w:pPr>
-        <w:pStyle w:val="ListBullet"/>
-      </w:pPr>
+        <w:t>Lease</w:t>
+      </w:r>
+      <w:r>
+        <w:rPr>
+          <w:rFonts w:ascii="Calibri" w:hAnsi="Calibri"/>
+          <w:color w:val="263038"/>
+          <w:sz w:val="21"/>
+        </w:rPr>
+        <w:t xml:space="preserve"> or left blank.</w:t>
+      </w:r>
+    </w:p>
+    <w:p>
+      <w:r>
+        <w:rPr>
+          <w:rFonts w:ascii="Calibri" w:hAnsi="Calibri"/>
+          <w:color w:val="263038"/>
+          <w:sz w:val="21"/>
+        </w:rPr>
+        <w:t xml:space="preserve">Scope alone is not sufficient. A user with only the </w:t>
+      </w:r>
       <w:r>
         <w:rPr>
           <w:rFonts w:ascii="Consolas" w:hAnsi="Consolas"/>
           <w:color w:val="246382"/>
           <w:sz w:val="20"/>
         </w:rPr>
-        <w:t>Base Rent</w:t>
-      </w:r>
-    </w:p>
-    <w:p>
-      <w:pPr>
-        <w:pStyle w:val="ListBullet"/>
-      </w:pPr>
+        <w:t>Responsible Officer</w:t>
+      </w:r>
+      <w:r>
+        <w:rPr>
+          <w:rFonts w:ascii="Calibri" w:hAnsi="Calibri"/>
+          <w:color w:val="263038"/>
+          <w:sz w:val="21"/>
+        </w:rPr>
+        <w:t xml:space="preserve"> role has clearance for Public, Internal, and Confidential parent Leases and for Internal and Confidential Lease Documents. That role cannot create a Restricted Lease Document or create against a Restricted Lease.</w:t>
+      </w:r>
+    </w:p>
+    <w:p>
+      <w:r>
+        <w:rPr>
+          <w:rFonts w:ascii="Calibri" w:hAnsi="Calibri"/>
+          <w:color w:val="263038"/>
+          <w:sz w:val="21"/>
+        </w:rPr>
+        <w:t xml:space="preserve">Frappe combines permissions from all roles assigned to a user. For example, a user who has both </w:t>
+      </w:r>
       <w:r>
         <w:rPr>
           <w:rFonts w:ascii="Consolas" w:hAnsi="Consolas"/>
           <w:color w:val="246382"/>
           <w:sz w:val="20"/>
         </w:rPr>
-        <w:t>Service Charge</w:t>
-      </w:r>
-    </w:p>
-    <w:p>
-      <w:pPr>
-        <w:pStyle w:val="ListBullet"/>
-      </w:pPr>
+        <w:t>Responsible Officer</w:t>
+      </w:r>
+      <w:r>
+        <w:rPr>
+          <w:rFonts w:ascii="Calibri" w:hAnsi="Calibri"/>
+          <w:color w:val="263038"/>
+          <w:sz w:val="21"/>
+        </w:rPr>
+        <w:t xml:space="preserve"> and </w:t>
+      </w:r>
       <w:r>
         <w:rPr>
           <w:rFonts w:ascii="Consolas" w:hAnsi="Consolas"/>
           <w:color w:val="246382"/>
           <w:sz w:val="20"/>
         </w:rPr>
-        <w:t>Tax</w:t>
-      </w:r>
-    </w:p>
-    <w:p>
-      <w:pPr>
-        <w:pStyle w:val="ListBullet"/>
-      </w:pPr>
+        <w:t>Legal Approver</w:t>
+      </w:r>
+      <w:r>
+        <w:rPr>
+          <w:rFonts w:ascii="Calibri" w:hAnsi="Calibri"/>
+          <w:color w:val="263038"/>
+          <w:sz w:val="21"/>
+        </w:rPr>
+        <w:t xml:space="preserve">, </w:t>
+      </w:r>
       <w:r>
         <w:rPr>
           <w:rFonts w:ascii="Consolas" w:hAnsi="Consolas"/>
           <w:color w:val="246382"/>
           <w:sz w:val="20"/>
         </w:rPr>
-        <w:t>Total Due</w:t>
-      </w:r>
-    </w:p>
-    <w:p>
-      <w:pPr>
-        <w:pStyle w:val="ListBullet"/>
-      </w:pPr>
+        <w:t>Management Approver</w:t>
+      </w:r>
+      <w:r>
+        <w:rPr>
+          <w:rFonts w:ascii="Calibri" w:hAnsi="Calibri"/>
+          <w:color w:val="263038"/>
+          <w:sz w:val="21"/>
+        </w:rPr>
+        <w:t xml:space="preserve">, or </w:t>
+      </w:r>
       <w:r>
         <w:rPr>
           <w:rFonts w:ascii="Consolas" w:hAnsi="Consolas"/>
           <w:color w:val="246382"/>
           <w:sz w:val="20"/>
         </w:rPr>
-        <w:t>Payment Status</w:t>
-      </w:r>
-    </w:p>
-    <w:p>
-      <w:pPr>
-        <w:pStyle w:val="ListBullet"/>
-      </w:pPr>
+        <w:t>Lease Auditor</w:t>
+      </w:r>
+      <w:r>
+        <w:rPr>
+          <w:rFonts w:ascii="Calibri" w:hAnsi="Calibri"/>
+          <w:color w:val="263038"/>
+          <w:sz w:val="21"/>
+        </w:rPr>
+        <w:t xml:space="preserve"> receives Lease Document create permission from </w:t>
+      </w:r>
       <w:r>
         <w:rPr>
           <w:rFonts w:ascii="Consolas" w:hAnsi="Consolas"/>
           <w:color w:val="246382"/>
           <w:sz w:val="20"/>
         </w:rPr>
-        <w:t>Schedule Status</w:t>
-      </w:r>
-    </w:p>
-    <w:p>
-      <w:pPr>
-        <w:pStyle w:val="ListBullet"/>
-      </w:pPr>
+        <w:t>Responsible Officer</w:t>
+      </w:r>
+      <w:r>
+        <w:rPr>
+          <w:rFonts w:ascii="Calibri" w:hAnsi="Calibri"/>
+          <w:color w:val="263038"/>
+          <w:sz w:val="21"/>
+        </w:rPr>
+        <w:t xml:space="preserve"> and Restricted clearance from the additional role. The user can then create a Restricted Lease Document for a Restricted Lease only when the assignment or Lease Department scope condition is also satisfied.</w:t>
+      </w:r>
+    </w:p>
+    <w:p>
+      <w:r>
+        <w:rPr>
+          <w:rFonts w:ascii="Calibri" w:hAnsi="Calibri"/>
+          <w:color w:val="263038"/>
+          <w:sz w:val="21"/>
+        </w:rPr>
+        <w:t>Every attached file must also be private. The application checks the user's permission to use the File record, its owner or original attachment, the allowed file extension, and the site's maximum file size. After attachment, Frappe resolves private-file access through the Lease Document, so the linked Lease scope and document confidentiality rule also govern file reads and downloads.</w:t>
+      </w:r>
+    </w:p>
+    <w:p>
+      <w:pPr>
+        <w:pStyle w:val="Heading2"/>
+      </w:pPr>
+      <w:r>
+        <w:t>11.4 Creating and Controlling Revisions</w:t>
+      </w:r>
+    </w:p>
+    <w:p>
+      <w:r>
+        <w:rPr>
+          <w:rFonts w:ascii="Calibri" w:hAnsi="Calibri"/>
+          <w:color w:val="263038"/>
+          <w:sz w:val="21"/>
+        </w:rPr>
+        <w:t xml:space="preserve">The </w:t>
+      </w:r>
       <w:r>
         <w:rPr>
           <w:rFonts w:ascii="Consolas" w:hAnsi="Consolas"/>
           <w:color w:val="246382"/>
           <w:sz w:val="20"/>
         </w:rPr>
-        <w:t>Payment Reference</w:t>
-      </w:r>
-    </w:p>
-    <w:p>
-      <w:pPr>
-        <w:pStyle w:val="ListBullet"/>
-      </w:pPr>
+        <w:t>Create Revision</w:t>
+      </w:r>
+      <w:r>
+        <w:rPr>
+          <w:rFonts w:ascii="Calibri" w:hAnsi="Calibri"/>
+          <w:color w:val="263038"/>
+          <w:sz w:val="21"/>
+        </w:rPr>
+        <w:t xml:space="preserve"> action appears only for a current revision when the user can create Lease Documents and can write the current record. The new record receives its name before the application assigns Document Family ID, Revision number, Revised By, and Revised On through Frappe's validation lifecycle. A revision must use a different private file, remain on the same Lease, include a Revision Reason, and branch from the current revision. Saving it updates the previous revision through the normal Frappe save lifecycle, including permission checks and change tracking, and marks the previous revision </w:t>
+      </w:r>
       <w:r>
         <w:rPr>
           <w:rFonts w:ascii="Consolas" w:hAnsi="Consolas"/>
           <w:color w:val="246382"/>
           <w:sz w:val="20"/>
         </w:rPr>
-        <w:t>Paid On</w:t>
+        <w:t>Superseded</w:t>
+      </w:r>
+      <w:r>
+        <w:rPr>
+          <w:rFonts w:ascii="Calibri" w:hAnsi="Calibri"/>
+          <w:color w:val="263038"/>
+          <w:sz w:val="21"/>
+        </w:rPr>
+        <w:t>.</w:t>
+      </w:r>
+    </w:p>
+    <w:p>
+      <w:r>
+        <w:rPr>
+          <w:rFonts w:ascii="Calibri" w:hAnsi="Calibri"/>
+          <w:color w:val="263038"/>
+          <w:sz w:val="21"/>
+        </w:rPr>
+        <w:t>Document classifications and revision permissions are enforced on direct API requests as well as the Desk form; hiding the button is only a usability aid.</w:t>
+      </w:r>
+    </w:p>
+    <w:p>
+      <w:r>
+        <w:rPr>
+          <w:rFonts w:ascii="Calibri" w:hAnsi="Calibri"/>
+          <w:color w:val="263038"/>
+          <w:sz w:val="21"/>
+        </w:rPr>
+        <w:t>Document categories include:</w:t>
       </w:r>
     </w:p>
     <w:p>
@@ -5437,15 +5625,98 @@
           <w:color w:val="246382"/>
           <w:sz w:val="20"/>
         </w:rPr>
-        <w:t>Notes</w:t>
-      </w:r>
-    </w:p>
-    <w:p>
-      <w:pPr>
-        <w:pStyle w:val="Heading2"/>
-      </w:pPr>
-      <w:r>
-        <w:t>12.2 System Behavior</w:t>
+        <w:t>Signed Agreement</w:t>
+      </w:r>
+    </w:p>
+    <w:p>
+      <w:pPr>
+        <w:pStyle w:val="ListBullet"/>
+      </w:pPr>
+      <w:r>
+        <w:rPr>
+          <w:rFonts w:ascii="Consolas" w:hAnsi="Consolas"/>
+          <w:color w:val="246382"/>
+          <w:sz w:val="20"/>
+        </w:rPr>
+        <w:t>Addendum</w:t>
+      </w:r>
+    </w:p>
+    <w:p>
+      <w:pPr>
+        <w:pStyle w:val="ListBullet"/>
+      </w:pPr>
+      <w:r>
+        <w:rPr>
+          <w:rFonts w:ascii="Consolas" w:hAnsi="Consolas"/>
+          <w:color w:val="246382"/>
+          <w:sz w:val="20"/>
+        </w:rPr>
+        <w:t>Renewal Letter</w:t>
+      </w:r>
+    </w:p>
+    <w:p>
+      <w:pPr>
+        <w:pStyle w:val="ListBullet"/>
+      </w:pPr>
+      <w:r>
+        <w:rPr>
+          <w:rFonts w:ascii="Consolas" w:hAnsi="Consolas"/>
+          <w:color w:val="246382"/>
+          <w:sz w:val="20"/>
+        </w:rPr>
+        <w:t>Approval</w:t>
+      </w:r>
+    </w:p>
+    <w:p>
+      <w:pPr>
+        <w:pStyle w:val="ListBullet"/>
+      </w:pPr>
+      <w:r>
+        <w:rPr>
+          <w:rFonts w:ascii="Consolas" w:hAnsi="Consolas"/>
+          <w:color w:val="246382"/>
+          <w:sz w:val="20"/>
+        </w:rPr>
+        <w:t>Payment Receipt</w:t>
+      </w:r>
+    </w:p>
+    <w:p>
+      <w:pPr>
+        <w:pStyle w:val="ListBullet"/>
+      </w:pPr>
+      <w:r>
+        <w:rPr>
+          <w:rFonts w:ascii="Consolas" w:hAnsi="Consolas"/>
+          <w:color w:val="246382"/>
+          <w:sz w:val="20"/>
+        </w:rPr>
+        <w:t>Valuation</w:t>
+      </w:r>
+    </w:p>
+    <w:p>
+      <w:pPr>
+        <w:pStyle w:val="ListBullet"/>
+      </w:pPr>
+      <w:r>
+        <w:rPr>
+          <w:rFonts w:ascii="Consolas" w:hAnsi="Consolas"/>
+          <w:color w:val="246382"/>
+          <w:sz w:val="20"/>
+        </w:rPr>
+        <w:t>Correspondence</w:t>
+      </w:r>
+    </w:p>
+    <w:p>
+      <w:pPr>
+        <w:pStyle w:val="ListBullet"/>
+      </w:pPr>
+      <w:r>
+        <w:rPr>
+          <w:rFonts w:ascii="Consolas" w:hAnsi="Consolas"/>
+          <w:color w:val="246382"/>
+          <w:sz w:val="20"/>
+        </w:rPr>
+        <w:t>Other</w:t>
       </w:r>
     </w:p>
     <w:p>
@@ -5455,7 +5726,33 @@
           <w:color w:val="263038"/>
           <w:sz w:val="21"/>
         </w:rPr>
-        <w:t xml:space="preserve">The system calculates </w:t>
+        <w:t>Important rule:</w:t>
+      </w:r>
+    </w:p>
+    <w:p>
+      <w:pPr>
+        <w:pStyle w:val="ListBullet"/>
+      </w:pPr>
+      <w:r>
+        <w:rPr>
+          <w:rFonts w:ascii="Calibri" w:hAnsi="Calibri"/>
+          <w:color w:val="263038"/>
+          <w:sz w:val="21"/>
+        </w:rPr>
+        <w:t>A completed renewal requires a private supporting document before the workflow can be finalized.</w:t>
+      </w:r>
+    </w:p>
+    <w:p>
+      <w:pPr>
+        <w:pStyle w:val="ListBullet"/>
+      </w:pPr>
+      <w:r>
+        <w:rPr>
+          <w:rFonts w:ascii="Calibri" w:hAnsi="Calibri"/>
+          <w:color w:val="263038"/>
+          <w:sz w:val="21"/>
+        </w:rPr>
+        <w:t xml:space="preserve">If the recommendation is not </w:t>
       </w:r>
       <w:r>
         <w:rPr>
@@ -5463,7 +5760,7 @@
           <w:color w:val="246382"/>
           <w:sz w:val="20"/>
         </w:rPr>
-        <w:t>Total Due</w:t>
+        <w:t>Terminate</w:t>
       </w:r>
       <w:r>
         <w:rPr>
@@ -5471,30 +5768,36 @@
           <w:color w:val="263038"/>
           <w:sz w:val="21"/>
         </w:rPr>
-        <w:t xml:space="preserve"> as:</w:t>
-      </w:r>
-    </w:p>
-    <w:p>
-      <w:pPr>
-        <w:pStyle w:val="ListBullet"/>
-      </w:pPr>
+        <w:t xml:space="preserve">, the required category is </w:t>
+      </w:r>
       <w:r>
         <w:rPr>
           <w:rFonts w:ascii="Consolas" w:hAnsi="Consolas"/>
           <w:color w:val="246382"/>
           <w:sz w:val="20"/>
         </w:rPr>
-        <w:t>Base Rent + Service Charge + Tax</w:t>
-      </w:r>
-    </w:p>
-    <w:p>
+        <w:t>Renewal Letter</w:t>
+      </w:r>
       <w:r>
         <w:rPr>
           <w:rFonts w:ascii="Calibri" w:hAnsi="Calibri"/>
           <w:color w:val="263038"/>
           <w:sz w:val="21"/>
         </w:rPr>
-        <w:t xml:space="preserve">The system also derives </w:t>
+        <w:t>.</w:t>
+      </w:r>
+    </w:p>
+    <w:p>
+      <w:pPr>
+        <w:pStyle w:val="ListBullet"/>
+      </w:pPr>
+      <w:r>
+        <w:rPr>
+          <w:rFonts w:ascii="Calibri" w:hAnsi="Calibri"/>
+          <w:color w:val="263038"/>
+          <w:sz w:val="21"/>
+        </w:rPr>
+        <w:t xml:space="preserve">If the recommendation is </w:t>
       </w:r>
       <w:r>
         <w:rPr>
@@ -5502,7 +5805,7 @@
           <w:color w:val="246382"/>
           <w:sz w:val="20"/>
         </w:rPr>
-        <w:t>Schedule Status</w:t>
+        <w:t>Terminate</w:t>
       </w:r>
       <w:r>
         <w:rPr>
@@ -5510,20 +5813,15 @@
           <w:color w:val="263038"/>
           <w:sz w:val="21"/>
         </w:rPr>
-        <w:t xml:space="preserve"> automatically:</w:t>
-      </w:r>
-    </w:p>
-    <w:p>
-      <w:pPr>
-        <w:pStyle w:val="ListBullet"/>
-      </w:pPr>
+        <w:t xml:space="preserve">, the required category is </w:t>
+      </w:r>
       <w:r>
         <w:rPr>
           <w:rFonts w:ascii="Consolas" w:hAnsi="Consolas"/>
           <w:color w:val="246382"/>
           <w:sz w:val="20"/>
         </w:rPr>
-        <w:t>Planned</w:t>
+        <w:t>Approval</w:t>
       </w:r>
       <w:r>
         <w:rPr>
@@ -5531,20 +5829,33 @@
           <w:color w:val="263038"/>
           <w:sz w:val="21"/>
         </w:rPr>
-        <w:t xml:space="preserve"> if due date is in the future</w:t>
-      </w:r>
-    </w:p>
-    <w:p>
-      <w:pPr>
-        <w:pStyle w:val="ListBullet"/>
-      </w:pPr>
+        <w:t>.</w:t>
+      </w:r>
+    </w:p>
+    <w:p>
+      <w:pPr>
+        <w:pStyle w:val="Heading1"/>
+      </w:pPr>
+      <w:r>
+        <w:t>12. Rent Schedules and Payment Tracking</w:t>
+      </w:r>
+    </w:p>
+    <w:p>
+      <w:r>
+        <w:rPr>
+          <w:rFonts w:ascii="Calibri" w:hAnsi="Calibri"/>
+          <w:color w:val="263038"/>
+          <w:sz w:val="21"/>
+        </w:rPr>
+        <w:t xml:space="preserve">Open </w:t>
+      </w:r>
       <w:r>
         <w:rPr>
           <w:rFonts w:ascii="Consolas" w:hAnsi="Consolas"/>
           <w:color w:val="246382"/>
           <w:sz w:val="20"/>
         </w:rPr>
-        <w:t>Due</w:t>
+        <w:t>Operations &gt; Rent Schedules</w:t>
       </w:r>
       <w:r>
         <w:rPr>
@@ -5552,7 +5863,25 @@
           <w:color w:val="263038"/>
           <w:sz w:val="21"/>
         </w:rPr>
-        <w:t xml:space="preserve"> if due today</w:t>
+        <w:t>.</w:t>
+      </w:r>
+    </w:p>
+    <w:p>
+      <w:r>
+        <w:rPr>
+          <w:rFonts w:ascii="Calibri" w:hAnsi="Calibri"/>
+          <w:color w:val="263038"/>
+          <w:sz w:val="21"/>
+        </w:rPr>
+        <w:t>Use rent schedules to track planned payment obligations by lease and period.</w:t>
+      </w:r>
+    </w:p>
+    <w:p>
+      <w:pPr>
+        <w:pStyle w:val="Heading2"/>
+      </w:pPr>
+      <w:r>
+        <w:t>12.1 Key Fields</w:t>
       </w:r>
     </w:p>
     <w:p>
@@ -5565,28 +5894,215 @@
           <w:color w:val="246382"/>
           <w:sz w:val="20"/>
         </w:rPr>
-        <w:t>Overdue</w:t>
-      </w:r>
+        <w:t>Lease</w:t>
+      </w:r>
+    </w:p>
+    <w:p>
+      <w:pPr>
+        <w:pStyle w:val="ListBullet"/>
+      </w:pPr>
+      <w:r>
+        <w:rPr>
+          <w:rFonts w:ascii="Consolas" w:hAnsi="Consolas"/>
+          <w:color w:val="246382"/>
+          <w:sz w:val="20"/>
+        </w:rPr>
+        <w:t>Description</w:t>
+      </w:r>
+    </w:p>
+    <w:p>
+      <w:pPr>
+        <w:pStyle w:val="ListBullet"/>
+      </w:pPr>
+      <w:r>
+        <w:rPr>
+          <w:rFonts w:ascii="Consolas" w:hAnsi="Consolas"/>
+          <w:color w:val="246382"/>
+          <w:sz w:val="20"/>
+        </w:rPr>
+        <w:t>Period From</w:t>
+      </w:r>
+    </w:p>
+    <w:p>
+      <w:pPr>
+        <w:pStyle w:val="ListBullet"/>
+      </w:pPr>
+      <w:r>
+        <w:rPr>
+          <w:rFonts w:ascii="Consolas" w:hAnsi="Consolas"/>
+          <w:color w:val="246382"/>
+          <w:sz w:val="20"/>
+        </w:rPr>
+        <w:t>Period To</w:t>
+      </w:r>
+    </w:p>
+    <w:p>
+      <w:pPr>
+        <w:pStyle w:val="ListBullet"/>
+      </w:pPr>
+      <w:r>
+        <w:rPr>
+          <w:rFonts w:ascii="Consolas" w:hAnsi="Consolas"/>
+          <w:color w:val="246382"/>
+          <w:sz w:val="20"/>
+        </w:rPr>
+        <w:t>Due Date</w:t>
+      </w:r>
+    </w:p>
+    <w:p>
+      <w:pPr>
+        <w:pStyle w:val="ListBullet"/>
+      </w:pPr>
+      <w:r>
+        <w:rPr>
+          <w:rFonts w:ascii="Consolas" w:hAnsi="Consolas"/>
+          <w:color w:val="246382"/>
+          <w:sz w:val="20"/>
+        </w:rPr>
+        <w:t>Currency</w:t>
+      </w:r>
+    </w:p>
+    <w:p>
+      <w:pPr>
+        <w:pStyle w:val="ListBullet"/>
+      </w:pPr>
+      <w:r>
+        <w:rPr>
+          <w:rFonts w:ascii="Consolas" w:hAnsi="Consolas"/>
+          <w:color w:val="246382"/>
+          <w:sz w:val="20"/>
+        </w:rPr>
+        <w:t>Base Rent</w:t>
+      </w:r>
+    </w:p>
+    <w:p>
+      <w:pPr>
+        <w:pStyle w:val="ListBullet"/>
+      </w:pPr>
+      <w:r>
+        <w:rPr>
+          <w:rFonts w:ascii="Consolas" w:hAnsi="Consolas"/>
+          <w:color w:val="246382"/>
+          <w:sz w:val="20"/>
+        </w:rPr>
+        <w:t>Service Charge</w:t>
+      </w:r>
+    </w:p>
+    <w:p>
+      <w:pPr>
+        <w:pStyle w:val="ListBullet"/>
+      </w:pPr>
+      <w:r>
+        <w:rPr>
+          <w:rFonts w:ascii="Consolas" w:hAnsi="Consolas"/>
+          <w:color w:val="246382"/>
+          <w:sz w:val="20"/>
+        </w:rPr>
+        <w:t>Tax</w:t>
+      </w:r>
+    </w:p>
+    <w:p>
+      <w:pPr>
+        <w:pStyle w:val="ListBullet"/>
+      </w:pPr>
+      <w:r>
+        <w:rPr>
+          <w:rFonts w:ascii="Consolas" w:hAnsi="Consolas"/>
+          <w:color w:val="246382"/>
+          <w:sz w:val="20"/>
+        </w:rPr>
+        <w:t>Total Due</w:t>
+      </w:r>
+    </w:p>
+    <w:p>
+      <w:pPr>
+        <w:pStyle w:val="ListBullet"/>
+      </w:pPr>
+      <w:r>
+        <w:rPr>
+          <w:rFonts w:ascii="Consolas" w:hAnsi="Consolas"/>
+          <w:color w:val="246382"/>
+          <w:sz w:val="20"/>
+        </w:rPr>
+        <w:t>Payment Status</w:t>
+      </w:r>
+    </w:p>
+    <w:p>
+      <w:pPr>
+        <w:pStyle w:val="ListBullet"/>
+      </w:pPr>
+      <w:r>
+        <w:rPr>
+          <w:rFonts w:ascii="Consolas" w:hAnsi="Consolas"/>
+          <w:color w:val="246382"/>
+          <w:sz w:val="20"/>
+        </w:rPr>
+        <w:t>Schedule Status</w:t>
+      </w:r>
+    </w:p>
+    <w:p>
+      <w:pPr>
+        <w:pStyle w:val="ListBullet"/>
+      </w:pPr>
+      <w:r>
+        <w:rPr>
+          <w:rFonts w:ascii="Consolas" w:hAnsi="Consolas"/>
+          <w:color w:val="246382"/>
+          <w:sz w:val="20"/>
+        </w:rPr>
+        <w:t>Payment Reference</w:t>
+      </w:r>
+    </w:p>
+    <w:p>
+      <w:pPr>
+        <w:pStyle w:val="ListBullet"/>
+      </w:pPr>
+      <w:r>
+        <w:rPr>
+          <w:rFonts w:ascii="Consolas" w:hAnsi="Consolas"/>
+          <w:color w:val="246382"/>
+          <w:sz w:val="20"/>
+        </w:rPr>
+        <w:t>Paid On</w:t>
+      </w:r>
+    </w:p>
+    <w:p>
+      <w:pPr>
+        <w:pStyle w:val="ListBullet"/>
+      </w:pPr>
+      <w:r>
+        <w:rPr>
+          <w:rFonts w:ascii="Consolas" w:hAnsi="Consolas"/>
+          <w:color w:val="246382"/>
+          <w:sz w:val="20"/>
+        </w:rPr>
+        <w:t>Notes</w:t>
+      </w:r>
+    </w:p>
+    <w:p>
+      <w:pPr>
+        <w:pStyle w:val="Heading2"/>
+      </w:pPr>
+      <w:r>
+        <w:t>12.2 System Behavior</w:t>
+      </w:r>
+    </w:p>
+    <w:p>
       <w:r>
         <w:rPr>
           <w:rFonts w:ascii="Calibri" w:hAnsi="Calibri"/>
           <w:color w:val="263038"/>
           <w:sz w:val="21"/>
         </w:rPr>
-        <w:t xml:space="preserve"> if due date has passed and not settled</w:t>
-      </w:r>
-    </w:p>
-    <w:p>
-      <w:pPr>
-        <w:pStyle w:val="ListBullet"/>
-      </w:pPr>
+        <w:t xml:space="preserve">The system calculates </w:t>
+      </w:r>
       <w:r>
         <w:rPr>
           <w:rFonts w:ascii="Consolas" w:hAnsi="Consolas"/>
           <w:color w:val="246382"/>
           <w:sz w:val="20"/>
         </w:rPr>
-        <w:t>Paid</w:t>
+        <w:t>Total Due</w:t>
       </w:r>
       <w:r>
         <w:rPr>
@@ -5594,28 +6110,38 @@
           <w:color w:val="263038"/>
           <w:sz w:val="21"/>
         </w:rPr>
-        <w:t xml:space="preserve"> if payment status is </w:t>
-      </w:r>
+        <w:t xml:space="preserve"> as:</w:t>
+      </w:r>
+    </w:p>
+    <w:p>
+      <w:pPr>
+        <w:pStyle w:val="ListBullet"/>
+      </w:pPr>
       <w:r>
         <w:rPr>
           <w:rFonts w:ascii="Consolas" w:hAnsi="Consolas"/>
           <w:color w:val="246382"/>
           <w:sz w:val="20"/>
         </w:rPr>
-        <w:t>Paid</w:t>
-      </w:r>
-    </w:p>
-    <w:p>
-      <w:pPr>
-        <w:pStyle w:val="ListBullet"/>
-      </w:pPr>
+        <w:t>Base Rent + Service Charge + Tax</w:t>
+      </w:r>
+    </w:p>
+    <w:p>
+      <w:r>
+        <w:rPr>
+          <w:rFonts w:ascii="Calibri" w:hAnsi="Calibri"/>
+          <w:color w:val="263038"/>
+          <w:sz w:val="21"/>
+        </w:rPr>
+        <w:t xml:space="preserve">The system also derives </w:t>
+      </w:r>
       <w:r>
         <w:rPr>
           <w:rFonts w:ascii="Consolas" w:hAnsi="Consolas"/>
           <w:color w:val="246382"/>
           <w:sz w:val="20"/>
         </w:rPr>
-        <w:t>Waived</w:t>
+        <w:t>Schedule Status</w:t>
       </w:r>
       <w:r>
         <w:rPr>
@@ -5623,15 +6149,28 @@
           <w:color w:val="263038"/>
           <w:sz w:val="21"/>
         </w:rPr>
-        <w:t xml:space="preserve"> if payment status is </w:t>
-      </w:r>
+        <w:t xml:space="preserve"> automatically:</w:t>
+      </w:r>
+    </w:p>
+    <w:p>
+      <w:pPr>
+        <w:pStyle w:val="ListBullet"/>
+      </w:pPr>
       <w:r>
         <w:rPr>
           <w:rFonts w:ascii="Consolas" w:hAnsi="Consolas"/>
           <w:color w:val="246382"/>
           <w:sz w:val="20"/>
         </w:rPr>
-        <w:t>Waived</w:t>
+        <w:t>Planned</w:t>
+      </w:r>
+      <w:r>
+        <w:rPr>
+          <w:rFonts w:ascii="Calibri" w:hAnsi="Calibri"/>
+          <w:color w:val="263038"/>
+          <w:sz w:val="21"/>
+        </w:rPr>
+        <w:t xml:space="preserve"> if due date is in the future</w:t>
       </w:r>
     </w:p>
     <w:p>
@@ -5644,7 +6183,7 @@
           <w:color w:val="246382"/>
           <w:sz w:val="20"/>
         </w:rPr>
-        <w:t>Cancelled</w:t>
+        <w:t>Due</w:t>
       </w:r>
       <w:r>
         <w:rPr>
@@ -5652,77 +6191,125 @@
           <w:color w:val="263038"/>
           <w:sz w:val="21"/>
         </w:rPr>
-        <w:t xml:space="preserve"> if the record is cancelled</w:t>
-      </w:r>
-    </w:p>
-    <w:p>
-      <w:pPr>
-        <w:pStyle w:val="Heading2"/>
-      </w:pPr>
-      <w:r>
-        <w:t>12.3 Validation Rules</w:t>
-      </w:r>
-    </w:p>
-    <w:p>
+        <w:t xml:space="preserve"> if due today</w:t>
+      </w:r>
+    </w:p>
+    <w:p>
+      <w:pPr>
+        <w:pStyle w:val="ListBullet"/>
+      </w:pPr>
+      <w:r>
+        <w:rPr>
+          <w:rFonts w:ascii="Consolas" w:hAnsi="Consolas"/>
+          <w:color w:val="246382"/>
+          <w:sz w:val="20"/>
+        </w:rPr>
+        <w:t>Overdue</w:t>
+      </w:r>
       <w:r>
         <w:rPr>
           <w:rFonts w:ascii="Calibri" w:hAnsi="Calibri"/>
           <w:color w:val="263038"/>
           <w:sz w:val="21"/>
         </w:rPr>
-        <w:t>The system prevents:</w:t>
+        <w:t xml:space="preserve"> if due date has passed and not settled</w:t>
       </w:r>
     </w:p>
     <w:p>
       <w:pPr>
         <w:pStyle w:val="ListBullet"/>
       </w:pPr>
+      <w:r>
+        <w:rPr>
+          <w:rFonts w:ascii="Consolas" w:hAnsi="Consolas"/>
+          <w:color w:val="246382"/>
+          <w:sz w:val="20"/>
+        </w:rPr>
+        <w:t>Paid</w:t>
+      </w:r>
       <w:r>
         <w:rPr>
           <w:rFonts w:ascii="Calibri" w:hAnsi="Calibri"/>
           <w:color w:val="263038"/>
           <w:sz w:val="21"/>
         </w:rPr>
-        <w:t>Period end before period start</w:t>
+        <w:t xml:space="preserve"> if payment status is </w:t>
+      </w:r>
+      <w:r>
+        <w:rPr>
+          <w:rFonts w:ascii="Consolas" w:hAnsi="Consolas"/>
+          <w:color w:val="246382"/>
+          <w:sz w:val="20"/>
+        </w:rPr>
+        <w:t>Paid</w:t>
       </w:r>
     </w:p>
     <w:p>
       <w:pPr>
         <w:pStyle w:val="ListBullet"/>
       </w:pPr>
+      <w:r>
+        <w:rPr>
+          <w:rFonts w:ascii="Consolas" w:hAnsi="Consolas"/>
+          <w:color w:val="246382"/>
+          <w:sz w:val="20"/>
+        </w:rPr>
+        <w:t>Waived</w:t>
+      </w:r>
       <w:r>
         <w:rPr>
           <w:rFonts w:ascii="Calibri" w:hAnsi="Calibri"/>
           <w:color w:val="263038"/>
           <w:sz w:val="21"/>
         </w:rPr>
-        <w:t>Rent periods outside the parent lease start and end dates</w:t>
+        <w:t xml:space="preserve"> if payment status is </w:t>
+      </w:r>
+      <w:r>
+        <w:rPr>
+          <w:rFonts w:ascii="Consolas" w:hAnsi="Consolas"/>
+          <w:color w:val="246382"/>
+          <w:sz w:val="20"/>
+        </w:rPr>
+        <w:t>Waived</w:t>
       </w:r>
     </w:p>
     <w:p>
       <w:pPr>
         <w:pStyle w:val="ListBullet"/>
       </w:pPr>
+      <w:r>
+        <w:rPr>
+          <w:rFonts w:ascii="Consolas" w:hAnsi="Consolas"/>
+          <w:color w:val="246382"/>
+          <w:sz w:val="20"/>
+        </w:rPr>
+        <w:t>Cancelled</w:t>
+      </w:r>
       <w:r>
         <w:rPr>
           <w:rFonts w:ascii="Calibri" w:hAnsi="Calibri"/>
           <w:color w:val="263038"/>
           <w:sz w:val="21"/>
         </w:rPr>
-        <w:t>Negative amounts</w:t>
-      </w:r>
-    </w:p>
-    <w:p>
-      <w:pPr>
-        <w:pStyle w:val="ListBullet"/>
-      </w:pPr>
+        <w:t xml:space="preserve"> if the record is cancelled</w:t>
+      </w:r>
+    </w:p>
+    <w:p>
+      <w:pPr>
+        <w:pStyle w:val="Heading2"/>
+      </w:pPr>
+      <w:r>
+        <w:t>12.3 Validation Rules</w:t>
+      </w:r>
+    </w:p>
+    <w:p>
       <w:r>
         <w:rPr>
           <w:rFonts w:ascii="Calibri" w:hAnsi="Calibri"/>
           <w:color w:val="263038"/>
           <w:sz w:val="21"/>
         </w:rPr>
-        <w:t>Empty schedules with all zero amounts</w:t>
+        <w:t>The system prevents:</w:t>
       </w:r>
     </w:p>
     <w:p>
@@ -5735,24 +6322,76 @@
           <w:color w:val="263038"/>
           <w:sz w:val="21"/>
         </w:rPr>
-        <w:t>Currency mismatch between schedule and lease</w:t>
-      </w:r>
-    </w:p>
-    <w:p>
-      <w:pPr>
-        <w:pStyle w:val="Heading1"/>
-      </w:pPr>
-      <w:r>
-        <w:t>13. Renewal Request Workflow</w:t>
-      </w:r>
-    </w:p>
-    <w:p>
+        <w:t>Period end before period start</w:t>
+      </w:r>
+    </w:p>
+    <w:p>
+      <w:pPr>
+        <w:pStyle w:val="ListBullet"/>
+      </w:pPr>
       <w:r>
         <w:rPr>
           <w:rFonts w:ascii="Calibri" w:hAnsi="Calibri"/>
           <w:color w:val="263038"/>
           <w:sz w:val="21"/>
         </w:rPr>
+        <w:t>Rent periods outside the parent lease start and end dates</w:t>
+      </w:r>
+    </w:p>
+    <w:p>
+      <w:pPr>
+        <w:pStyle w:val="ListBullet"/>
+      </w:pPr>
+      <w:r>
+        <w:rPr>
+          <w:rFonts w:ascii="Calibri" w:hAnsi="Calibri"/>
+          <w:color w:val="263038"/>
+          <w:sz w:val="21"/>
+        </w:rPr>
+        <w:t>Negative amounts</w:t>
+      </w:r>
+    </w:p>
+    <w:p>
+      <w:pPr>
+        <w:pStyle w:val="ListBullet"/>
+      </w:pPr>
+      <w:r>
+        <w:rPr>
+          <w:rFonts w:ascii="Calibri" w:hAnsi="Calibri"/>
+          <w:color w:val="263038"/>
+          <w:sz w:val="21"/>
+        </w:rPr>
+        <w:t>Empty schedules with all zero amounts</w:t>
+      </w:r>
+    </w:p>
+    <w:p>
+      <w:pPr>
+        <w:pStyle w:val="ListBullet"/>
+      </w:pPr>
+      <w:r>
+        <w:rPr>
+          <w:rFonts w:ascii="Calibri" w:hAnsi="Calibri"/>
+          <w:color w:val="263038"/>
+          <w:sz w:val="21"/>
+        </w:rPr>
+        <w:t>Currency mismatch between schedule and lease</w:t>
+      </w:r>
+    </w:p>
+    <w:p>
+      <w:pPr>
+        <w:pStyle w:val="Heading1"/>
+      </w:pPr>
+      <w:r>
+        <w:t>13. Renewal Request Workflow</w:t>
+      </w:r>
+    </w:p>
+    <w:p>
+      <w:r>
+        <w:rPr>
+          <w:rFonts w:ascii="Calibri" w:hAnsi="Calibri"/>
+          <w:color w:val="263038"/>
+          <w:sz w:val="21"/>
+        </w:rPr>
         <w:t xml:space="preserve">Open </w:t>
       </w:r>
       <w:r>
@@ -9369,21 +10008,21 @@
       </w:r>
     </w:p>
     <w:p>
-      <w:pPr>
-        <w:pStyle w:val="Heading2"/>
-      </w:pPr>
-      <w:r>
-        <w:t>22.3 Assigned-user and department access</w:t>
-      </w:r>
-    </w:p>
-    <w:p>
       <w:r>
         <w:rPr>
           <w:rFonts w:ascii="Calibri" w:hAnsi="Calibri"/>
           <w:color w:val="263038"/>
           <w:sz w:val="21"/>
         </w:rPr>
-        <w:t>For scoped users, a lease is visible when the user is the Responsible Officer, Contract Owner, or Backup Officer, or when a Frappe User Permission grants that user the lease's Lease Department. The User Permission must allow Lease Department, match Responsible Department, and either be globally applicable or applicable to Lease. The same rule flows down to Renewal Requests, Rent Schedules, Lease Documents, and Reminder Logs through their Lease link. Lease Documents add their own confidentiality check after the parent Lease check.</w:t>
+        <w:t>For Lease Document specifically, the default create grant belongs to Rent Renewal System Manager, Lease Administrator, and Responsible Officer. Administrator retains the Frappe permission bypass. System Manager alone bypasses the record-level filter but cannot create a Lease Document because the default Lease Document permission matrix does not grant that role create permission.</w:t>
+      </w:r>
+    </w:p>
+    <w:p>
+      <w:pPr>
+        <w:pStyle w:val="Heading2"/>
+      </w:pPr>
+      <w:r>
+        <w:t>22.3 Assigned-user and department access</w:t>
       </w:r>
     </w:p>
     <w:p>
@@ -9393,15 +10032,7 @@
           <w:color w:val="263038"/>
           <w:sz w:val="21"/>
         </w:rPr>
-        <w:t>When a new Lease is saved, the same scope is evaluated from its proposed values before insertion. Unrestricted operational roles may create without assignment. A Responsible Officer must assign themselves as Responsible Officer, Contract Owner, or Backup Officer, or hold the matching Lease Department User Permission, and the selected classification must be within their clearance. Related records must link to a Lease the user is authorized to access.</w:t>
-      </w:r>
-    </w:p>
-    <w:p>
-      <w:pPr>
-        <w:pStyle w:val="Heading2"/>
-      </w:pPr>
-      <w:r>
-        <w:t>22.4 Confidentiality clearance</w:t>
+        <w:t>For scoped users, a lease is visible when the user is the Responsible Officer, Contract Owner, or Backup Officer, or when a Frappe User Permission grants that user the lease's Lease Department. The User Permission must allow Lease Department, match Responsible Department, and either be globally applicable or applicable to Lease. The same rule flows down to Renewal Requests, Rent Schedules, Lease Documents, and Reminder Logs through their Lease link. Lease Documents add their own confidentiality check after the parent Lease check.</w:t>
       </w:r>
     </w:p>
     <w:p>
@@ -9411,7 +10042,35 @@
           <w:color w:val="263038"/>
           <w:sz w:val="21"/>
         </w:rPr>
+        <w:t>When a new Lease is saved, the same scope is evaluated from its proposed values before insertion. Unrestricted operational roles may create without assignment. A Responsible Officer must assign themselves as Responsible Officer, Contract Owner, or Backup Officer, or hold the matching Lease Department User Permission, and the selected classification must be within their clearance. Related records must link to a Lease the user is authorized to access.</w:t>
+      </w:r>
+    </w:p>
+    <w:p>
+      <w:pPr>
+        <w:pStyle w:val="Heading2"/>
+      </w:pPr>
+      <w:r>
+        <w:t>22.4 Confidentiality clearance</w:t>
+      </w:r>
+    </w:p>
+    <w:p>
+      <w:r>
+        <w:rPr>
+          <w:rFonts w:ascii="Calibri" w:hAnsi="Calibri"/>
+          <w:color w:val="263038"/>
+          <w:sz w:val="21"/>
+        </w:rPr>
         <w:t>Lease Viewer can see Public and Internal leases. Responsible Officer, Department Head, and Finance Approver can see Public, Internal, and Confidential leases. Legal Approver, Management Approver, and Lease Auditor can see Public, Internal, Confidential, and Restricted leases. A user with multiple roles receives the union of those clearances. Lease Document access must pass this parent clearance and the document's Internal, Confidential, or Restricted classification; a user may see the Lease while a stricter linked document and private file remain hidden.</w:t>
+      </w:r>
+    </w:p>
+    <w:p>
+      <w:r>
+        <w:rPr>
+          <w:rFonts w:ascii="Calibri" w:hAnsi="Calibri"/>
+          <w:color w:val="263038"/>
+          <w:sz w:val="21"/>
+        </w:rPr>
+        <w:t>Role permissions are also combined. A user with Responsible Officer plus Legal Approver, Management Approver, or Lease Auditor receives Lease Document create permission from Responsible Officer and Restricted clearance from the additional role, but the user must still be assigned to the Lease or hold the matching Lease Department User Permission.</w:t>
       </w:r>
     </w:p>
     <w:p>

</xml_diff>

<commit_message>
Expand confidentiality manual guidance
</commit_message>
<xml_diff>
--- a/docs/Rent Renewal Tracker Knowledge Base and User Manual.docx
+++ b/docs/Rent Renewal Tracker Knowledge Base and User Manual.docx
@@ -74,7 +74,7 @@
           <w:color w:val="5F6C76"/>
           <w:sz w:val="20"/>
         </w:rPr>
-        <w:t>Prepared 16 July 2026</w:t>
+        <w:t>Prepared 17 July 2026</w:t>
       </w:r>
     </w:p>
     <w:p/>
@@ -191,7 +191,7 @@
                 <w:color w:val="263038"/>
                 <w:sz w:val="20"/>
               </w:rPr>
-              <w:t>This manual is derived from the application source in this workspace as of 16 July 2026. It documents implemented behavior. Site-specific Frappe configuration, custom roles, email accounts, print formats, and future code changes may alter what an individual user sees.</w:t>
+              <w:t>This manual is derived from the application source in this workspace as of 17 July 2026. It documents implemented behavior. Site-specific Frappe configuration, custom roles, email accounts, print formats, and future code changes may alter what an individual user sees.</w:t>
             </w:r>
           </w:p>
         </w:tc>
@@ -11476,27 +11476,371 @@
         <w:pStyle w:val="Heading2"/>
       </w:pPr>
       <w:r>
-        <w:t>22.4 Confidentiality clearance</w:t>
-      </w:r>
-    </w:p>
-    <w:p>
-      <w:r>
-        <w:rPr>
-          <w:rFonts w:ascii="Calibri" w:hAnsi="Calibri"/>
-          <w:color w:val="263038"/>
-          <w:sz w:val="21"/>
-        </w:rPr>
-        <w:t>Lease Viewer can see Public and Internal leases. Responsible Officer, Department Head, and Finance Approver can see Public, Internal, and Confidential leases. Legal Approver, Management Approver, and Lease Auditor can see Public, Internal, Confidential, and Restricted leases. A user with multiple roles receives the union of those clearances. Lease Document access must pass this parent clearance and the document's Internal, Confidential, or Restricted classification; a user may see the Lease while a stricter linked document and private file remain hidden.</w:t>
-      </w:r>
-    </w:p>
-    <w:p>
-      <w:r>
-        <w:rPr>
-          <w:rFonts w:ascii="Calibri" w:hAnsi="Calibri"/>
-          <w:color w:val="263038"/>
-          <w:sz w:val="21"/>
-        </w:rPr>
-        <w:t>Role permissions are also combined. A user with Responsible Officer plus Legal Approver, Management Approver, or Lease Auditor receives Lease Document create permission from Responsible Officer and Restricted clearance from the additional role, but the user must still be assigned to the Lease or hold the matching Lease Department User Permission.</w:t>
+        <w:t>22.4 Confidentiality classification and clearance</w:t>
+      </w:r>
+    </w:p>
+    <w:p>
+      <w:r>
+        <w:rPr>
+          <w:rFonts w:ascii="Consolas" w:hAnsi="Consolas"/>
+          <w:color w:val="246382"/>
+          <w:sz w:val="20"/>
+        </w:rPr>
+        <w:t>Confidentiality Classification</w:t>
+      </w:r>
+      <w:r>
+        <w:rPr>
+          <w:rFonts w:ascii="Calibri" w:hAnsi="Calibri"/>
+          <w:color w:val="263038"/>
+          <w:sz w:val="21"/>
+        </w:rPr>
+        <w:t xml:space="preserve"> is a required Lease field and defaults to </w:t>
+      </w:r>
+      <w:r>
+        <w:rPr>
+          <w:rFonts w:ascii="Consolas" w:hAnsi="Consolas"/>
+          <w:color w:val="246382"/>
+          <w:sz w:val="20"/>
+        </w:rPr>
+        <w:t>Internal</w:t>
+      </w:r>
+      <w:r>
+        <w:rPr>
+          <w:rFonts w:ascii="Calibri" w:hAnsi="Calibri"/>
+          <w:color w:val="263038"/>
+          <w:sz w:val="21"/>
+        </w:rPr>
+        <w:t>. It controls how sensitive the entire Lease record is treated. Classification is one access gate rather than a complete permission by itself: a scoped user must also have the required application role and DocType permission and must be assigned as Responsible Officer, Contract Owner, or Backup Officer, or hold the matching Lease Department User Permission.</w:t>
+      </w:r>
+    </w:p>
+    <w:p>
+      <w:pPr>
+        <w:pStyle w:val="ListBullet"/>
+      </w:pPr>
+      <w:r>
+        <w:rPr>
+          <w:rFonts w:ascii="Consolas" w:hAnsi="Consolas"/>
+          <w:color w:val="246382"/>
+          <w:sz w:val="20"/>
+        </w:rPr>
+        <w:t>Public</w:t>
+      </w:r>
+      <w:r>
+        <w:rPr>
+          <w:rFonts w:ascii="Calibri" w:hAnsi="Calibri"/>
+          <w:color w:val="263038"/>
+          <w:sz w:val="21"/>
+        </w:rPr>
+        <w:t>: use for low-sensitivity lease information that may be shared broadly among authorized Rent Renewal Tracker users. Public does not mean internet-public, website-visible, or available to Guest; Guest users receive no application access.</w:t>
+      </w:r>
+    </w:p>
+    <w:p>
+      <w:pPr>
+        <w:pStyle w:val="ListBullet"/>
+      </w:pPr>
+      <w:r>
+        <w:rPr>
+          <w:rFonts w:ascii="Consolas" w:hAnsi="Consolas"/>
+          <w:color w:val="246382"/>
+          <w:sz w:val="20"/>
+        </w:rPr>
+        <w:t>Internal</w:t>
+      </w:r>
+      <w:r>
+        <w:rPr>
+          <w:rFonts w:ascii="Calibri" w:hAnsi="Calibri"/>
+          <w:color w:val="263038"/>
+          <w:sz w:val="21"/>
+        </w:rPr>
+        <w:t>: use for routine operational leases intended for staff inside the organization. This is the recommended default for ordinary leases.</w:t>
+      </w:r>
+    </w:p>
+    <w:p>
+      <w:pPr>
+        <w:pStyle w:val="ListBullet"/>
+      </w:pPr>
+      <w:r>
+        <w:rPr>
+          <w:rFonts w:ascii="Consolas" w:hAnsi="Consolas"/>
+          <w:color w:val="246382"/>
+          <w:sz w:val="20"/>
+        </w:rPr>
+        <w:t>Confidential</w:t>
+      </w:r>
+      <w:r>
+        <w:rPr>
+          <w:rFonts w:ascii="Calibri" w:hAnsi="Calibri"/>
+          <w:color w:val="263038"/>
+          <w:sz w:val="21"/>
+        </w:rPr>
+        <w:t>: use for commercially sensitive leases containing negotiated rents, special terms, sensitive counterparty information, or material internal assessments. This level excludes Lease Viewer.</w:t>
+      </w:r>
+    </w:p>
+    <w:p>
+      <w:pPr>
+        <w:pStyle w:val="ListBullet"/>
+      </w:pPr>
+      <w:r>
+        <w:rPr>
+          <w:rFonts w:ascii="Consolas" w:hAnsi="Consolas"/>
+          <w:color w:val="246382"/>
+          <w:sz w:val="20"/>
+        </w:rPr>
+        <w:t>Restricted</w:t>
+      </w:r>
+      <w:r>
+        <w:rPr>
+          <w:rFonts w:ascii="Calibri" w:hAnsi="Calibri"/>
+          <w:color w:val="263038"/>
+          <w:sz w:val="21"/>
+        </w:rPr>
+        <w:t>: use only for highly sensitive leases involving litigation, executive matters, investigations, strategic negotiations, exceptional financial terms, or similarly limited information.</w:t>
+      </w:r>
+    </w:p>
+    <w:p>
+      <w:r>
+        <w:rPr>
+          <w:rFonts w:ascii="Calibri" w:hAnsi="Calibri"/>
+          <w:color w:val="263038"/>
+          <w:sz w:val="21"/>
+        </w:rPr>
+        <w:t>Public and Internal currently have the same technical role-clearance boundary. Their difference is the business handling label: Public means broadly shareable within the authorized app population, while Internal records information as ordinary internal-only material. Neither classification bypasses assignment, department scope, DocType permission, or authentication.</w:t>
+      </w:r>
+    </w:p>
+    <w:p>
+      <w:r>
+        <w:rPr>
+          <w:rFonts w:ascii="Calibri" w:hAnsi="Calibri"/>
+          <w:color w:val="263038"/>
+          <w:sz w:val="21"/>
+        </w:rPr>
+        <w:t>Clearance by scoped role is:</w:t>
+      </w:r>
+    </w:p>
+    <w:p>
+      <w:pPr>
+        <w:pStyle w:val="ListBullet"/>
+      </w:pPr>
+      <w:r>
+        <w:rPr>
+          <w:rFonts w:ascii="Consolas" w:hAnsi="Consolas"/>
+          <w:color w:val="246382"/>
+          <w:sz w:val="20"/>
+        </w:rPr>
+        <w:t>Lease Viewer</w:t>
+      </w:r>
+      <w:r>
+        <w:rPr>
+          <w:rFonts w:ascii="Calibri" w:hAnsi="Calibri"/>
+          <w:color w:val="263038"/>
+          <w:sz w:val="21"/>
+        </w:rPr>
+        <w:t>: Public and Internal.</w:t>
+      </w:r>
+    </w:p>
+    <w:p>
+      <w:pPr>
+        <w:pStyle w:val="ListBullet"/>
+      </w:pPr>
+      <w:r>
+        <w:rPr>
+          <w:rFonts w:ascii="Consolas" w:hAnsi="Consolas"/>
+          <w:color w:val="246382"/>
+          <w:sz w:val="20"/>
+        </w:rPr>
+        <w:t>Responsible Officer</w:t>
+      </w:r>
+      <w:r>
+        <w:rPr>
+          <w:rFonts w:ascii="Calibri" w:hAnsi="Calibri"/>
+          <w:color w:val="263038"/>
+          <w:sz w:val="21"/>
+        </w:rPr>
+        <w:t xml:space="preserve">, </w:t>
+      </w:r>
+      <w:r>
+        <w:rPr>
+          <w:rFonts w:ascii="Consolas" w:hAnsi="Consolas"/>
+          <w:color w:val="246382"/>
+          <w:sz w:val="20"/>
+        </w:rPr>
+        <w:t>Department Head</w:t>
+      </w:r>
+      <w:r>
+        <w:rPr>
+          <w:rFonts w:ascii="Calibri" w:hAnsi="Calibri"/>
+          <w:color w:val="263038"/>
+          <w:sz w:val="21"/>
+        </w:rPr>
+        <w:t xml:space="preserve">, and </w:t>
+      </w:r>
+      <w:r>
+        <w:rPr>
+          <w:rFonts w:ascii="Consolas" w:hAnsi="Consolas"/>
+          <w:color w:val="246382"/>
+          <w:sz w:val="20"/>
+        </w:rPr>
+        <w:t>Finance Approver</w:t>
+      </w:r>
+      <w:r>
+        <w:rPr>
+          <w:rFonts w:ascii="Calibri" w:hAnsi="Calibri"/>
+          <w:color w:val="263038"/>
+          <w:sz w:val="21"/>
+        </w:rPr>
+        <w:t>: Public, Internal, and Confidential.</w:t>
+      </w:r>
+    </w:p>
+    <w:p>
+      <w:pPr>
+        <w:pStyle w:val="ListBullet"/>
+      </w:pPr>
+      <w:r>
+        <w:rPr>
+          <w:rFonts w:ascii="Consolas" w:hAnsi="Consolas"/>
+          <w:color w:val="246382"/>
+          <w:sz w:val="20"/>
+        </w:rPr>
+        <w:t>Legal Approver</w:t>
+      </w:r>
+      <w:r>
+        <w:rPr>
+          <w:rFonts w:ascii="Calibri" w:hAnsi="Calibri"/>
+          <w:color w:val="263038"/>
+          <w:sz w:val="21"/>
+        </w:rPr>
+        <w:t xml:space="preserve">, </w:t>
+      </w:r>
+      <w:r>
+        <w:rPr>
+          <w:rFonts w:ascii="Consolas" w:hAnsi="Consolas"/>
+          <w:color w:val="246382"/>
+          <w:sz w:val="20"/>
+        </w:rPr>
+        <w:t>Management Approver</w:t>
+      </w:r>
+      <w:r>
+        <w:rPr>
+          <w:rFonts w:ascii="Calibri" w:hAnsi="Calibri"/>
+          <w:color w:val="263038"/>
+          <w:sz w:val="21"/>
+        </w:rPr>
+        <w:t xml:space="preserve">, and </w:t>
+      </w:r>
+      <w:r>
+        <w:rPr>
+          <w:rFonts w:ascii="Consolas" w:hAnsi="Consolas"/>
+          <w:color w:val="246382"/>
+          <w:sz w:val="20"/>
+        </w:rPr>
+        <w:t>Lease Auditor</w:t>
+      </w:r>
+      <w:r>
+        <w:rPr>
+          <w:rFonts w:ascii="Calibri" w:hAnsi="Calibri"/>
+          <w:color w:val="263038"/>
+          <w:sz w:val="21"/>
+        </w:rPr>
+        <w:t>: Public, Internal, Confidential, and Restricted.</w:t>
+      </w:r>
+    </w:p>
+    <w:p>
+      <w:pPr>
+        <w:pStyle w:val="ListBullet"/>
+      </w:pPr>
+      <w:r>
+        <w:rPr>
+          <w:rFonts w:ascii="Consolas" w:hAnsi="Consolas"/>
+          <w:color w:val="246382"/>
+          <w:sz w:val="20"/>
+        </w:rPr>
+        <w:t>Administrator</w:t>
+      </w:r>
+      <w:r>
+        <w:rPr>
+          <w:rFonts w:ascii="Calibri" w:hAnsi="Calibri"/>
+          <w:color w:val="263038"/>
+          <w:sz w:val="21"/>
+        </w:rPr>
+        <w:t xml:space="preserve">, </w:t>
+      </w:r>
+      <w:r>
+        <w:rPr>
+          <w:rFonts w:ascii="Consolas" w:hAnsi="Consolas"/>
+          <w:color w:val="246382"/>
+          <w:sz w:val="20"/>
+        </w:rPr>
+        <w:t>System Manager</w:t>
+      </w:r>
+      <w:r>
+        <w:rPr>
+          <w:rFonts w:ascii="Calibri" w:hAnsi="Calibri"/>
+          <w:color w:val="263038"/>
+          <w:sz w:val="21"/>
+        </w:rPr>
+        <w:t xml:space="preserve">, </w:t>
+      </w:r>
+      <w:r>
+        <w:rPr>
+          <w:rFonts w:ascii="Consolas" w:hAnsi="Consolas"/>
+          <w:color w:val="246382"/>
+          <w:sz w:val="20"/>
+        </w:rPr>
+        <w:t>Rent Renewal System Manager</w:t>
+      </w:r>
+      <w:r>
+        <w:rPr>
+          <w:rFonts w:ascii="Calibri" w:hAnsi="Calibri"/>
+          <w:color w:val="263038"/>
+          <w:sz w:val="21"/>
+        </w:rPr>
+        <w:t xml:space="preserve">, and </w:t>
+      </w:r>
+      <w:r>
+        <w:rPr>
+          <w:rFonts w:ascii="Consolas" w:hAnsi="Consolas"/>
+          <w:color w:val="246382"/>
+          <w:sz w:val="20"/>
+        </w:rPr>
+        <w:t>Lease Administrator</w:t>
+      </w:r>
+      <w:r>
+        <w:rPr>
+          <w:rFonts w:ascii="Calibri" w:hAnsi="Calibri"/>
+          <w:color w:val="263038"/>
+          <w:sz w:val="21"/>
+        </w:rPr>
+        <w:t>: bypass the classification and assignment filters as unrestricted roles, while the normal DocType action matrix still determines what each role may create, write, submit, cancel, export, or delete.</w:t>
+      </w:r>
+    </w:p>
+    <w:p>
+      <w:r>
+        <w:rPr>
+          <w:rFonts w:ascii="Calibri" w:hAnsi="Calibri"/>
+          <w:color w:val="263038"/>
+          <w:sz w:val="21"/>
+        </w:rPr>
+        <w:t>A user with multiple roles receives the union of those clearances. For example, Responsible Officer plus Legal Approver receives create and submit authority from Responsible Officer and Restricted clearance from Legal Approver, but the user must still be assigned to the Lease or hold the matching Lease Department User Permission.</w:t>
+      </w:r>
+    </w:p>
+    <w:p>
+      <w:r>
+        <w:rPr>
+          <w:rFonts w:ascii="Calibri" w:hAnsi="Calibri"/>
+          <w:color w:val="263038"/>
+          <w:sz w:val="21"/>
+        </w:rPr>
+        <w:t>The classification is enforced when leases are listed, opened, created, saved, reported, exported, or counted on permission-aware dashboards. Renewal Requests, Rent Schedules, and Reminder Logs inherit the parent Lease authorization through their Lease link. Lease Documents must pass both the parent Lease classification and the document's separate Internal, Confidential, or Restricted classification, so a user may see a Lease while a stricter linked document and its private file remain hidden. Restricted leases also display a red warning in the Lease form, and a successor Lease created from a completed renewal inherits the predecessor's classification.</w:t>
+      </w:r>
+    </w:p>
+    <w:p>
+      <w:r>
+        <w:rPr>
+          <w:rFonts w:ascii="Calibri" w:hAnsi="Calibri"/>
+          <w:color w:val="263038"/>
+          <w:sz w:val="21"/>
+        </w:rPr>
+        <w:t>Choose the classification before submitting the Lease. Changes to a submitted Lease follow the normal Frappe amendment and document-control process.</w:t>
       </w:r>
     </w:p>
     <w:p>
@@ -32791,7 +33135,7 @@
                 <w:color w:val="263038"/>
                 <w:sz w:val="18"/>
               </w:rPr>
-              <w:t>The lease-level access label Public, Internal, Confidential, or Restricted.</w:t>
+              <w:t>The required lease-level sensitivity label Public, Internal, Confidential, or Restricted. It works together with role permission and assignment or department scope; Public never means guest or website access.</w:t>
             </w:r>
           </w:p>
         </w:tc>

</xml_diff>